<commit_message>
Plain-language results and add database error leak to defects
Co-Authored-By: Claude Opus 5.5 <noreply@anthropic.com>
</commit_message>
<xml_diff>
--- a/Testing_Results_Table.docx
+++ b/Testing_Results_Table.docx
@@ -359,7 +359,7 @@
                 <w:sz w:val="16"/>
                 <w:szCs w:val="16"/>
               </w:rPr>
-              <w:t xml:space="preserve">Pre: fresh database import.</w:t>
+              <w:t xml:space="preserve">Before: load a fresh copy of the database.</w:t>
             </w:r>
           </w:p>
           <w:p>
@@ -456,7 +456,7 @@
                 <w:sz w:val="16"/>
                 <w:szCs w:val="16"/>
               </w:rPr>
-              <w:t xml:space="preserve">Seed data: 8 services, 4 mechanics, 4 orders with status Completed</w:t>
+              <w:t xml:space="preserve">Sample data: 8 services, 4 mechanics, 4 completed orders</w:t>
             </w:r>
           </w:p>
         </w:tc>
@@ -803,7 +803,7 @@
                 <w:sz w:val="16"/>
                 <w:szCs w:val="16"/>
               </w:rPr>
-              <w:t xml:space="preserve">; seed prices $18–$45 (sum $235 over 8 services)</w:t>
+              <w:t xml:space="preserve">; sample prices from $18 to $45 (8 services, $235 in total)</w:t>
             </w:r>
           </w:p>
         </w:tc>
@@ -861,7 +861,7 @@
                 <w:sz w:val="16"/>
                 <w:szCs w:val="16"/>
               </w:rPr>
-              <w:t xml:space="preserve">The URL changed to </w:t>
+              <w:t xml:space="preserve">The address changed to </w:t>
             </w:r>
             <w:r>
               <w:rPr>
@@ -876,7 +876,7 @@
                 <w:sz w:val="16"/>
                 <w:szCs w:val="16"/>
               </w:rPr>
-              <w:t xml:space="preserve">. The cards ran from Air Filter Replacement ($18.00) to Spark Plug Replacement ($45.00) in rising order. The boxes showed $18.00, $45.00, $29.38 and 8. </w:t>
+              <w:t xml:space="preserve">. The cards went from Air Filter Replacement ($18.00) to Spark Plug Replacement ($45.00) from cheapest to most expensive. The boxes showed $18.00, $45.00, $29.38 and 8. </w:t>
             </w:r>
             <w:r>
               <w:rPr>
@@ -1240,7 +1240,7 @@
                 <w:sz w:val="16"/>
                 <w:szCs w:val="16"/>
               </w:rPr>
-              <w:t xml:space="preserve">The page loaded with no error. The cards ran A–Z from Air Filter Replacement to Tire Rotation. </w:t>
+              <w:t xml:space="preserve">The page loaded with no error. The cards were in A–Z order, from Air Filter Replacement to Tire Rotation. </w:t>
             </w:r>
             <w:r>
               <w:rPr>
@@ -2634,7 +2634,77 @@
                 <w:sz w:val="16"/>
                 <w:szCs w:val="16"/>
               </w:rPr>
-              <w:t xml:space="preserve">. The browser </w:t>
+              <w:t xml:space="preserve">. The browser stops the form first.</w:t>
+            </w:r>
+          </w:p>
+          <w:p>
+            <w:pPr>
+              <w:jc w:val="left"/>
+            </w:pPr>
+            <w:r>
+              <w:rPr>
+                <w:sz w:val="16"/>
+                <w:szCs w:val="16"/>
+              </w:rPr>
+              <w:t xml:space="preserve">4. Switch off the browser check (the test does this with a script; the app code stays the same) and send the form again, so the server check is tested too.</w:t>
+            </w:r>
+          </w:p>
+        </w:tc>
+        <w:tc>
+          <w:tcPr>
+            <w:tcW w:type="dxa" w:w="1100"/>
+            <w:tcBorders>
+              <w:top w:val="single" w:color="999999" w:sz="4"/>
+              <w:left w:val="single" w:color="999999" w:sz="4"/>
+              <w:bottom w:val="single" w:color="999999" w:sz="4"/>
+              <w:right w:val="single" w:color="999999" w:sz="4"/>
+            </w:tcBorders>
+            <w:tcMar>
+              <w:top w:type="dxa" w:w="60"/>
+              <w:left w:type="dxa" w:w="90"/>
+              <w:bottom w:type="dxa" w:w="60"/>
+              <w:right w:type="dxa" w:w="90"/>
+            </w:tcMar>
+          </w:tcPr>
+          <w:p>
+            <w:pPr>
+              <w:jc w:val="left"/>
+            </w:pPr>
+            <w:r>
+              <w:rPr>
+                <w:sz w:val="16"/>
+                <w:szCs w:val="16"/>
+              </w:rPr>
+              <w:t xml:space="preserve">Invalid data; black box</w:t>
+            </w:r>
+          </w:p>
+        </w:tc>
+        <w:tc>
+          <w:tcPr>
+            <w:tcW w:type="dxa" w:w="1900"/>
+            <w:tcBorders>
+              <w:top w:val="single" w:color="999999" w:sz="4"/>
+              <w:left w:val="single" w:color="999999" w:sz="4"/>
+              <w:bottom w:val="single" w:color="999999" w:sz="4"/>
+              <w:right w:val="single" w:color="999999" w:sz="4"/>
+            </w:tcBorders>
+            <w:tcMar>
+              <w:top w:type="dxa" w:w="60"/>
+              <w:left w:type="dxa" w:w="90"/>
+              <w:bottom w:type="dxa" w:w="60"/>
+              <w:right w:type="dxa" w:w="90"/>
+            </w:tcMar>
+          </w:tcPr>
+          <w:p>
+            <w:pPr>
+              <w:jc w:val="left"/>
+            </w:pPr>
+            <w:r>
+              <w:rPr>
+                <w:sz w:val="16"/>
+                <w:szCs w:val="16"/>
+              </w:rPr>
+              <w:t xml:space="preserve">Date </w:t>
             </w:r>
             <w:r>
               <w:rPr>
@@ -2642,26 +2712,72 @@
                 <w:sz w:val="15"/>
                 <w:szCs w:val="15"/>
               </w:rPr>
-              <w:t xml:space="preserve">min</w:t>
-            </w:r>
-            <w:r>
-              <w:rPr>
-                <w:sz w:val="16"/>
-                <w:szCs w:val="16"/>
-              </w:rPr>
-              <w:t xml:space="preserve"> check blocks the form first.</w:t>
-            </w:r>
-          </w:p>
-          <w:p>
-            <w:pPr>
-              <w:jc w:val="left"/>
-            </w:pPr>
-            <w:r>
-              <w:rPr>
-                <w:sz w:val="16"/>
-                <w:szCs w:val="16"/>
-              </w:rPr>
-              <w:t xml:space="preserve">4. Turn off browser validation (</w:t>
+              <w:t xml:space="preserve">2026-10-07</w:t>
+            </w:r>
+            <w:r>
+              <w:rPr>
+                <w:sz w:val="16"/>
+                <w:szCs w:val="16"/>
+              </w:rPr>
+              <w:t xml:space="preserve"> (one day before the earliest allowed date)</w:t>
+            </w:r>
+          </w:p>
+        </w:tc>
+        <w:tc>
+          <w:tcPr>
+            <w:tcW w:type="dxa" w:w="1700"/>
+            <w:tcBorders>
+              <w:top w:val="single" w:color="999999" w:sz="4"/>
+              <w:left w:val="single" w:color="999999" w:sz="4"/>
+              <w:bottom w:val="single" w:color="999999" w:sz="4"/>
+              <w:right w:val="single" w:color="999999" w:sz="4"/>
+            </w:tcBorders>
+            <w:tcMar>
+              <w:top w:type="dxa" w:w="60"/>
+              <w:left w:type="dxa" w:w="90"/>
+              <w:bottom w:type="dxa" w:w="60"/>
+              <w:right w:type="dxa" w:w="90"/>
+            </w:tcMar>
+          </w:tcPr>
+          <w:p>
+            <w:pPr>
+              <w:jc w:val="left"/>
+            </w:pPr>
+            <w:r>
+              <w:rPr>
+                <w:sz w:val="16"/>
+                <w:szCs w:val="16"/>
+              </w:rPr>
+              <w:t xml:space="preserve">The app rejects the booking with “Please select a future date.” and saves no order.</w:t>
+            </w:r>
+          </w:p>
+        </w:tc>
+        <w:tc>
+          <w:tcPr>
+            <w:tcW w:type="dxa" w:w="5400"/>
+            <w:tcBorders>
+              <w:top w:val="single" w:color="999999" w:sz="4"/>
+              <w:left w:val="single" w:color="999999" w:sz="4"/>
+              <w:bottom w:val="single" w:color="999999" w:sz="4"/>
+              <w:right w:val="single" w:color="999999" w:sz="4"/>
+            </w:tcBorders>
+            <w:tcMar>
+              <w:top w:type="dxa" w:w="60"/>
+              <w:left w:type="dxa" w:w="90"/>
+              <w:bottom w:type="dxa" w:w="60"/>
+              <w:right w:type="dxa" w:w="90"/>
+            </w:tcMar>
+          </w:tcPr>
+          <w:p>
+            <w:pPr>
+              <w:jc w:val="left"/>
+            </w:pPr>
+            <w:r>
+              <w:rPr>
+                <w:sz w:val="16"/>
+                <w:szCs w:val="16"/>
+              </w:rPr>
+              <w:t xml:space="preserve">The browser showed the warning “Value must be 08.10.2026 or later.” (</w:t>
             </w:r>
             <w:r>
               <w:rPr>
@@ -2669,152 +2785,6 @@
                 <w:sz w:val="15"/>
                 <w:szCs w:val="15"/>
               </w:rPr>
-              <w:t xml:space="preserve">form.noValidate</w:t>
-            </w:r>
-            <w:r>
-              <w:rPr>
-                <w:sz w:val="16"/>
-                <w:szCs w:val="16"/>
-              </w:rPr>
-              <w:t xml:space="preserve">, no source change) and submit again.</w:t>
-            </w:r>
-          </w:p>
-        </w:tc>
-        <w:tc>
-          <w:tcPr>
-            <w:tcW w:type="dxa" w:w="1100"/>
-            <w:tcBorders>
-              <w:top w:val="single" w:color="999999" w:sz="4"/>
-              <w:left w:val="single" w:color="999999" w:sz="4"/>
-              <w:bottom w:val="single" w:color="999999" w:sz="4"/>
-              <w:right w:val="single" w:color="999999" w:sz="4"/>
-            </w:tcBorders>
-            <w:tcMar>
-              <w:top w:type="dxa" w:w="60"/>
-              <w:left w:type="dxa" w:w="90"/>
-              <w:bottom w:type="dxa" w:w="60"/>
-              <w:right w:type="dxa" w:w="90"/>
-            </w:tcMar>
-          </w:tcPr>
-          <w:p>
-            <w:pPr>
-              <w:jc w:val="left"/>
-            </w:pPr>
-            <w:r>
-              <w:rPr>
-                <w:sz w:val="16"/>
-                <w:szCs w:val="16"/>
-              </w:rPr>
-              <w:t xml:space="preserve">Invalid data; black box</w:t>
-            </w:r>
-          </w:p>
-        </w:tc>
-        <w:tc>
-          <w:tcPr>
-            <w:tcW w:type="dxa" w:w="1900"/>
-            <w:tcBorders>
-              <w:top w:val="single" w:color="999999" w:sz="4"/>
-              <w:left w:val="single" w:color="999999" w:sz="4"/>
-              <w:bottom w:val="single" w:color="999999" w:sz="4"/>
-              <w:right w:val="single" w:color="999999" w:sz="4"/>
-            </w:tcBorders>
-            <w:tcMar>
-              <w:top w:type="dxa" w:w="60"/>
-              <w:left w:type="dxa" w:w="90"/>
-              <w:bottom w:type="dxa" w:w="60"/>
-              <w:right w:type="dxa" w:w="90"/>
-            </w:tcMar>
-          </w:tcPr>
-          <w:p>
-            <w:pPr>
-              <w:jc w:val="left"/>
-            </w:pPr>
-            <w:r>
-              <w:rPr>
-                <w:sz w:val="16"/>
-                <w:szCs w:val="16"/>
-              </w:rPr>
-              <w:t xml:space="preserve">Date </w:t>
-            </w:r>
-            <w:r>
-              <w:rPr>
-                <w:rFonts w:ascii="Consolas" w:cs="Consolas" w:eastAsia="Consolas" w:hAnsi="Consolas"/>
-                <w:sz w:val="15"/>
-                <w:szCs w:val="15"/>
-              </w:rPr>
-              <w:t xml:space="preserve">2026-10-07</w:t>
-            </w:r>
-            <w:r>
-              <w:rPr>
-                <w:sz w:val="16"/>
-                <w:szCs w:val="16"/>
-              </w:rPr>
-              <w:t xml:space="preserve"> (one day before the earliest allowed date)</w:t>
-            </w:r>
-          </w:p>
-        </w:tc>
-        <w:tc>
-          <w:tcPr>
-            <w:tcW w:type="dxa" w:w="1700"/>
-            <w:tcBorders>
-              <w:top w:val="single" w:color="999999" w:sz="4"/>
-              <w:left w:val="single" w:color="999999" w:sz="4"/>
-              <w:bottom w:val="single" w:color="999999" w:sz="4"/>
-              <w:right w:val="single" w:color="999999" w:sz="4"/>
-            </w:tcBorders>
-            <w:tcMar>
-              <w:top w:type="dxa" w:w="60"/>
-              <w:left w:type="dxa" w:w="90"/>
-              <w:bottom w:type="dxa" w:w="60"/>
-              <w:right w:type="dxa" w:w="90"/>
-            </w:tcMar>
-          </w:tcPr>
-          <w:p>
-            <w:pPr>
-              <w:jc w:val="left"/>
-            </w:pPr>
-            <w:r>
-              <w:rPr>
-                <w:sz w:val="16"/>
-                <w:szCs w:val="16"/>
-              </w:rPr>
-              <w:t xml:space="preserve">The app rejects the booking with “Please select a future date.” and saves no order.</w:t>
-            </w:r>
-          </w:p>
-        </w:tc>
-        <w:tc>
-          <w:tcPr>
-            <w:tcW w:type="dxa" w:w="5400"/>
-            <w:tcBorders>
-              <w:top w:val="single" w:color="999999" w:sz="4"/>
-              <w:left w:val="single" w:color="999999" w:sz="4"/>
-              <w:bottom w:val="single" w:color="999999" w:sz="4"/>
-              <w:right w:val="single" w:color="999999" w:sz="4"/>
-            </w:tcBorders>
-            <w:tcMar>
-              <w:top w:type="dxa" w:w="60"/>
-              <w:left w:type="dxa" w:w="90"/>
-              <w:bottom w:type="dxa" w:w="60"/>
-              <w:right w:type="dxa" w:w="90"/>
-            </w:tcMar>
-          </w:tcPr>
-          <w:p>
-            <w:pPr>
-              <w:jc w:val="left"/>
-            </w:pPr>
-            <w:r>
-              <w:rPr>
-                <w:sz w:val="16"/>
-                <w:szCs w:val="16"/>
-              </w:rPr>
-              <w:t xml:space="preserve">The browser first showed the tooltip “Value must be 08.10.2026 or later.” (</w:t>
-            </w:r>
-            <w:r>
-              <w:rPr>
-                <w:rFonts w:ascii="Consolas" w:cs="Consolas" w:eastAsia="Consolas" w:hAnsi="Consolas"/>
-                <w:sz w:val="15"/>
-                <w:szCs w:val="15"/>
-              </w:rPr>
               <w:t xml:space="preserve">evidence/TC07_client_validation.png</w:t>
             </w:r>
             <w:r>
@@ -2822,7 +2792,7 @@
                 <w:sz w:val="16"/>
                 <w:szCs w:val="16"/>
               </w:rPr>
-              <w:t xml:space="preserve">). With browser validation off, the server answered “Please select a future date.” and showed no Order Summary. No order was saved. </w:t>
+              <w:t xml:space="preserve">). With the browser check off, the server showed “Please select a future date.” and no Order Summary. No order was saved. </w:t>
             </w:r>
             <w:r>
               <w:rPr>
@@ -3168,37 +3138,7 @@
                 <w:sz w:val="16"/>
                 <w:szCs w:val="16"/>
               </w:rPr>
-              <w:t xml:space="preserve">Name </w:t>
-            </w:r>
-            <w:r>
-              <w:rPr>
-                <w:rFonts w:ascii="Consolas" w:cs="Consolas" w:eastAsia="Consolas" w:hAnsi="Consolas"/>
-                <w:sz w:val="15"/>
-                <w:szCs w:val="15"/>
-              </w:rPr>
-              <w:t xml:space="preserve">"     "</w:t>
-            </w:r>
-            <w:r>
-              <w:rPr>
-                <w:sz w:val="16"/>
-                <w:szCs w:val="16"/>
-              </w:rPr>
-              <w:t xml:space="preserve"> (5 spaces; the browser </w:t>
-            </w:r>
-            <w:r>
-              <w:rPr>
-                <w:rFonts w:ascii="Consolas" w:cs="Consolas" w:eastAsia="Consolas" w:hAnsi="Consolas"/>
-                <w:sz w:val="15"/>
-                <w:szCs w:val="15"/>
-              </w:rPr>
-              <w:t xml:space="preserve">required</w:t>
-            </w:r>
-            <w:r>
-              <w:rPr>
-                <w:sz w:val="16"/>
-                <w:szCs w:val="16"/>
-              </w:rPr>
-              <w:t xml:space="preserve"> check lets it through, the server trims it to empty)</w:t>
+              <w:t xml:space="preserve">Name made of 5 spaces (the browser accepts it because the field is not empty; the server removes the spaces and finds nothing left)</w:t>
             </w:r>
           </w:p>
         </w:tc>
@@ -3572,22 +3512,7 @@
                 <w:sz w:val="16"/>
                 <w:szCs w:val="16"/>
               </w:rPr>
-              <w:t xml:space="preserve"> (100 characters, the size of the </w:t>
-            </w:r>
-            <w:r>
-              <w:rPr>
-                <w:rFonts w:ascii="Consolas" w:cs="Consolas" w:eastAsia="Consolas" w:hAnsi="Consolas"/>
-                <w:sz w:val="15"/>
-                <w:szCs w:val="15"/>
-              </w:rPr>
-              <w:t xml:space="preserve">customer_name VARCHAR(100)</w:t>
-            </w:r>
-            <w:r>
-              <w:rPr>
-                <w:sz w:val="16"/>
-                <w:szCs w:val="16"/>
-              </w:rPr>
-              <w:t xml:space="preserve"> column)</w:t>
+              <w:t xml:space="preserve"> (100 characters, the most the database can store)</w:t>
             </w:r>
           </w:p>
         </w:tc>
@@ -3961,7 +3886,7 @@
                 <w:sz w:val="16"/>
                 <w:szCs w:val="16"/>
               </w:rPr>
-              <w:t xml:space="preserve"> (101 characters, one above the 100-character column size)</w:t>
+              <w:t xml:space="preserve"> (101 characters, one more than the database can store)</w:t>
             </w:r>
           </w:p>
         </w:tc>
@@ -4019,7 +3944,7 @@
                 <w:sz w:val="16"/>
                 <w:szCs w:val="16"/>
               </w:rPr>
-              <w:t xml:space="preserve">The server answered HTTP 500 and the browser showed a blank white page with no message. The PHP log recorded “Uncaught mysqli_sql_exception: Data too long for column 'customer_name'”. No order was saved (the Orders page in Test 12 still has 11 orders). </w:t>
+              <w:t xml:space="preserve">The page went blank, with no message for the user. The server log said “Data too long for column 'customer_name'”. No order was saved: the Orders page in Test 12 still has 11 orders. </w:t>
             </w:r>
             <w:r>
               <w:rPr>
@@ -4050,7 +3975,7 @@
                 <w:sz w:val="16"/>
                 <w:szCs w:val="16"/>
               </w:rPr>
-              <w:t xml:space="preserve"> has no length check, so MySQL rejects the INSERT at line 84 and the uncaught exception stops the page. Evidence: </w:t>
+              <w:t xml:space="preserve"> never checks the name length. The database refuses the long name, and the page crashes instead of showing an error. Evidence: </w:t>
             </w:r>
             <w:r>
               <w:rPr>
@@ -4408,7 +4333,7 @@
                 <w:sz w:val="16"/>
                 <w:szCs w:val="16"/>
               </w:rPr>
-              <w:t xml:space="preserve">The server answered HTTP 500 and the browser showed a blank white page. The PHP log recorded “You have an error in your SQL syntax … near 'Connor'”. No order was saved. </w:t>
+              <w:t xml:space="preserve">The page went blank, with no message for the user. The server log said “You have an error in your SQL syntax … near 'Connor'”. No order was saved. </w:t>
             </w:r>
             <w:r>
               <w:rPr>
@@ -4439,7 +4364,7 @@
                 <w:sz w:val="16"/>
                 <w:szCs w:val="16"/>
               </w:rPr>
-              <w:t xml:space="preserve"> line 81 puts the name straight into the SQL text without escaping, so the apostrophe ends the string. The same gap allows SQL injection. Evidence: </w:t>
+              <w:t xml:space="preserve"> (line 81) pastes the name straight into the database command. The apostrophe ends the name too early and breaks the command. An attacker could use the same gap to run their own database commands (SQL injection). Evidence: </w:t>
             </w:r>
             <w:r>
               <w:rPr>
@@ -4584,7 +4509,7 @@
                 <w:sz w:val="16"/>
                 <w:szCs w:val="16"/>
               </w:rPr>
-              <w:t xml:space="preserve">Pre: Tests 5, 6 and 9 saved orders #9–#11.</w:t>
+              <w:t xml:space="preserve">Before: run Tests 5, 6 and 9 (they save orders #9–#11).</w:t>
             </w:r>
           </w:p>
           <w:p>
@@ -4710,7 +4635,7 @@
                 <w:sz w:val="16"/>
                 <w:szCs w:val="16"/>
               </w:rPr>
-              <w:t xml:space="preserve">The page shows 11 orders, total revenue $340.00 and average $30.91. Each row shows customer, service, mechanic, date, price and status.</w:t>
+              <w:t xml:space="preserve">The page shows 11 orders, total revenue $340.00 and average $30.91. Each row shows the customer, service, mechanic, date, price and status.</w:t>
             </w:r>
           </w:p>
         </w:tc>
@@ -4739,7 +4664,7 @@
                 <w:sz w:val="16"/>
                 <w:szCs w:val="16"/>
               </w:rPr>
-              <w:t xml:space="preserve">The page showed 11 Total orders, $340.00 Total revenue and $30.91 Average order value. The table listed all 11 orders with service and mechanic names from the joined tables, newest date first. </w:t>
+              <w:t xml:space="preserve">The page showed 11 Total orders, $340.00 Total revenue and $30.91 Average order value. The table listed all 11 orders with the service and mechanic names, newest date first. </w:t>
             </w:r>
             <w:r>
               <w:rPr>
@@ -5043,7 +4968,81 @@
                 <w:sz w:val="16"/>
                 <w:szCs w:val="16"/>
               </w:rPr>
-              <w:t xml:space="preserve"> (the lowest existing order number; the field has </w:t>
+              <w:t xml:space="preserve"> (the lowest order number that exists and the lowest the field accepts)</w:t>
+            </w:r>
+          </w:p>
+        </w:tc>
+        <w:tc>
+          <w:tcPr>
+            <w:tcW w:type="dxa" w:w="1700"/>
+            <w:tcBorders>
+              <w:top w:val="single" w:color="999999" w:sz="4"/>
+              <w:left w:val="single" w:color="999999" w:sz="4"/>
+              <w:bottom w:val="single" w:color="999999" w:sz="4"/>
+              <w:right w:val="single" w:color="999999" w:sz="4"/>
+            </w:tcBorders>
+            <w:tcMar>
+              <w:top w:type="dxa" w:w="60"/>
+              <w:left w:type="dxa" w:w="90"/>
+              <w:bottom w:type="dxa" w:w="60"/>
+              <w:right w:type="dxa" w:w="90"/>
+            </w:tcMar>
+          </w:tcPr>
+          <w:p>
+            <w:pPr>
+              <w:jc w:val="left"/>
+            </w:pPr>
+            <w:r>
+              <w:rPr>
+                <w:sz w:val="16"/>
+                <w:szCs w:val="16"/>
+              </w:rPr>
+              <w:t xml:space="preserve">The app shows a card “Order #1 found” with Marat Usenov, Oil Change, Arman Bekov.</w:t>
+            </w:r>
+          </w:p>
+        </w:tc>
+        <w:tc>
+          <w:tcPr>
+            <w:tcW w:type="dxa" w:w="5400"/>
+            <w:tcBorders>
+              <w:top w:val="single" w:color="999999" w:sz="4"/>
+              <w:left w:val="single" w:color="999999" w:sz="4"/>
+              <w:bottom w:val="single" w:color="999999" w:sz="4"/>
+              <w:right w:val="single" w:color="999999" w:sz="4"/>
+            </w:tcBorders>
+            <w:tcMar>
+              <w:top w:type="dxa" w:w="60"/>
+              <w:left w:type="dxa" w:w="90"/>
+              <w:bottom w:type="dxa" w:w="60"/>
+              <w:right w:type="dxa" w:w="90"/>
+            </w:tcMar>
+          </w:tcPr>
+          <w:p>
+            <w:pPr>
+              <w:jc w:val="left"/>
+            </w:pPr>
+            <w:r>
+              <w:rPr>
+                <w:sz w:val="16"/>
+                <w:szCs w:val="16"/>
+              </w:rPr>
+              <w:t xml:space="preserve">The page showed “Order #1 not found.”, yet order 1 (Marat Usenov) is in the table below it. </w:t>
+            </w:r>
+            <w:r>
+              <w:rPr>
+                <w:b/>
+                <w:bCs/>
+                <w:sz w:val="16"/>
+                <w:szCs w:val="16"/>
+              </w:rPr>
+              <w:t xml:space="preserve">FAIL.</w:t>
+            </w:r>
+            <w:r>
+              <w:rPr>
+                <w:sz w:val="16"/>
+                <w:szCs w:val="16"/>
+              </w:rPr>
+              <w:t xml:space="preserve"> Defect: </w:t>
             </w:r>
             <w:r>
               <w:rPr>
@@ -5051,88 +5050,14 @@
                 <w:sz w:val="15"/>
                 <w:szCs w:val="15"/>
               </w:rPr>
-              <w:t xml:space="preserve">min=1</w:t>
-            </w:r>
-            <w:r>
-              <w:rPr>
-                <w:sz w:val="16"/>
-                <w:szCs w:val="16"/>
-              </w:rPr>
-              <w:t xml:space="preserve">)</w:t>
-            </w:r>
-          </w:p>
-        </w:tc>
-        <w:tc>
-          <w:tcPr>
-            <w:tcW w:type="dxa" w:w="1700"/>
-            <w:tcBorders>
-              <w:top w:val="single" w:color="999999" w:sz="4"/>
-              <w:left w:val="single" w:color="999999" w:sz="4"/>
-              <w:bottom w:val="single" w:color="999999" w:sz="4"/>
-              <w:right w:val="single" w:color="999999" w:sz="4"/>
-            </w:tcBorders>
-            <w:tcMar>
-              <w:top w:type="dxa" w:w="60"/>
-              <w:left w:type="dxa" w:w="90"/>
-              <w:bottom w:type="dxa" w:w="60"/>
-              <w:right w:type="dxa" w:w="90"/>
-            </w:tcMar>
-          </w:tcPr>
-          <w:p>
-            <w:pPr>
-              <w:jc w:val="left"/>
-            </w:pPr>
-            <w:r>
-              <w:rPr>
-                <w:sz w:val="16"/>
-                <w:szCs w:val="16"/>
-              </w:rPr>
-              <w:t xml:space="preserve">The app shows a card “Order #1 found” with Marat Usenov, Oil Change, Arman Bekov.</w:t>
-            </w:r>
-          </w:p>
-        </w:tc>
-        <w:tc>
-          <w:tcPr>
-            <w:tcW w:type="dxa" w:w="5400"/>
-            <w:tcBorders>
-              <w:top w:val="single" w:color="999999" w:sz="4"/>
-              <w:left w:val="single" w:color="999999" w:sz="4"/>
-              <w:bottom w:val="single" w:color="999999" w:sz="4"/>
-              <w:right w:val="single" w:color="999999" w:sz="4"/>
-            </w:tcBorders>
-            <w:tcMar>
-              <w:top w:type="dxa" w:w="60"/>
-              <w:left w:type="dxa" w:w="90"/>
-              <w:bottom w:type="dxa" w:w="60"/>
-              <w:right w:type="dxa" w:w="90"/>
-            </w:tcMar>
-          </w:tcPr>
-          <w:p>
-            <w:pPr>
-              <w:jc w:val="left"/>
-            </w:pPr>
-            <w:r>
-              <w:rPr>
-                <w:sz w:val="16"/>
-                <w:szCs w:val="16"/>
-              </w:rPr>
-              <w:t xml:space="preserve">The page showed “Order #1 not found.” although order 1 (Marat Usenov) is in the table below. </w:t>
-            </w:r>
-            <w:r>
-              <w:rPr>
-                <w:b/>
-                <w:bCs/>
-                <w:sz w:val="16"/>
-                <w:szCs w:val="16"/>
-              </w:rPr>
-              <w:t xml:space="preserve">FAIL.</w:t>
-            </w:r>
-            <w:r>
-              <w:rPr>
-                <w:sz w:val="16"/>
-                <w:szCs w:val="16"/>
-              </w:rPr>
-              <w:t xml:space="preserve"> Defect: </w:t>
+              <w:t xml:space="preserve">orders.php</w:t>
+            </w:r>
+            <w:r>
+              <w:rPr>
+                <w:sz w:val="16"/>
+                <w:szCs w:val="16"/>
+              </w:rPr>
+              <w:t xml:space="preserve"> (line 63) compares the order number from the database, stored as text, with the number typed in, using a strict check (</w:t>
             </w:r>
             <w:r>
               <w:rPr>
@@ -5140,36 +5065,6 @@
                 <w:sz w:val="15"/>
                 <w:szCs w:val="15"/>
               </w:rPr>
-              <w:t xml:space="preserve">orders.php</w:t>
-            </w:r>
-            <w:r>
-              <w:rPr>
-                <w:sz w:val="16"/>
-                <w:szCs w:val="16"/>
-              </w:rPr>
-              <w:t xml:space="preserve"> line 63 compares </w:t>
-            </w:r>
-            <w:r>
-              <w:rPr>
-                <w:rFonts w:ascii="Consolas" w:cs="Consolas" w:eastAsia="Consolas" w:hAnsi="Consolas"/>
-                <w:sz w:val="15"/>
-                <w:szCs w:val="15"/>
-              </w:rPr>
-              <w:t xml:space="preserve">order_id</w:t>
-            </w:r>
-            <w:r>
-              <w:rPr>
-                <w:sz w:val="16"/>
-                <w:szCs w:val="16"/>
-              </w:rPr>
-              <w:t xml:space="preserve">, which MySQL returns as text, with the number from the form using </w:t>
-            </w:r>
-            <w:r>
-              <w:rPr>
-                <w:rFonts w:ascii="Consolas" w:cs="Consolas" w:eastAsia="Consolas" w:hAnsi="Consolas"/>
-                <w:sz w:val="15"/>
-                <w:szCs w:val="15"/>
-              </w:rPr>
               <w:t xml:space="preserve">===</w:t>
             </w:r>
             <w:r>
@@ -5177,7 +5072,7 @@
                 <w:sz w:val="16"/>
                 <w:szCs w:val="16"/>
               </w:rPr>
-              <w:t xml:space="preserve">. Text never equals a number, so the search never finds any order. Evidence: </w:t>
+              <w:t xml:space="preserve">). The strict check never matches text with a number, so the search never finds any order. Evidence: </w:t>
             </w:r>
             <w:r>
               <w:rPr>
@@ -5684,7 +5579,7 @@
                 <w:sz w:val="16"/>
                 <w:szCs w:val="16"/>
               </w:rPr>
-              <w:t xml:space="preserve">Pre: Tests 5, 6 and 9 added three Oil Change orders for Arman Bekov.</w:t>
+              <w:t xml:space="preserve">Before: run Tests 5, 6 and 9 (they add three Oil Change orders for Arman Bekov).</w:t>
             </w:r>
           </w:p>
           <w:p>
@@ -6070,7 +5965,7 @@
           <w:sz w:val="18"/>
           <w:szCs w:val="18"/>
         </w:rPr>
-        <w:t xml:space="preserve">Actual result (Test 2): The URL changed to </w:t>
+        <w:t xml:space="preserve">Actual result (Test 2): The address changed to </w:t>
       </w:r>
       <w:r>
         <w:rPr>
@@ -6085,7 +5980,7 @@
           <w:sz w:val="18"/>
           <w:szCs w:val="18"/>
         </w:rPr>
-        <w:t xml:space="preserve">. The cards ran from Air Filter Replacement ($18.00) to Spark Plug Replacement ($45.00) in rising order. The boxes showed $18.00, $45.00, $29.38 and 8. </w:t>
+        <w:t xml:space="preserve">. The cards went from Air Filter Replacement ($18.00) to Spark Plug Replacement ($45.00) from cheapest to most expensive. The boxes showed $18.00, $45.00, $29.38 and 8. </w:t>
       </w:r>
       <w:r>
         <w:rPr>
@@ -6160,7 +6055,7 @@
           <w:sz w:val="18"/>
           <w:szCs w:val="18"/>
         </w:rPr>
-        <w:t xml:space="preserve">Actual result (Test 3): The page loaded with no error. The cards ran A–Z from Air Filter Replacement to Tire Rotation. </w:t>
+        <w:t xml:space="preserve">Actual result (Test 3): The page loaded with no error. The cards were in A–Z order, from Air Filter Replacement to Tire Rotation. </w:t>
       </w:r>
       <w:r>
         <w:rPr>
@@ -6460,7 +6355,7 @@
           <w:sz w:val="18"/>
           <w:szCs w:val="18"/>
         </w:rPr>
-        <w:t xml:space="preserve">Actual result (Test 7): The browser first showed the tooltip “Value must be 08.10.2026 or later.” (</w:t>
+        <w:t xml:space="preserve">Actual result (Test 7): The browser showed the warning “Value must be 08.10.2026 or later.” (</w:t>
       </w:r>
       <w:r>
         <w:rPr>
@@ -6475,7 +6370,7 @@
           <w:sz w:val="18"/>
           <w:szCs w:val="18"/>
         </w:rPr>
-        <w:t xml:space="preserve">). With browser validation off, the server answered “Please select a future date.” and showed no Order Summary. No order was saved. </w:t>
+        <w:t xml:space="preserve">). With the browser check off, the server showed “Please select a future date.” and no Order Summary. No order was saved. </w:t>
       </w:r>
       <w:r>
         <w:rPr>
@@ -6550,7 +6445,7 @@
           <w:sz w:val="18"/>
           <w:szCs w:val="18"/>
         </w:rPr>
-        <w:t xml:space="preserve">Actual result (Test 7): The browser first showed the tooltip “Value must be 08.10.2026 or later.” (</w:t>
+        <w:t xml:space="preserve">Actual result (Test 7): The browser showed the warning “Value must be 08.10.2026 or later.” (</w:t>
       </w:r>
       <w:r>
         <w:rPr>
@@ -6565,7 +6460,7 @@
           <w:sz w:val="18"/>
           <w:szCs w:val="18"/>
         </w:rPr>
-        <w:t xml:space="preserve">). With browser validation off, the server answered “Please select a future date.” and showed no Order Summary. No order was saved. </w:t>
+        <w:t xml:space="preserve">). With the browser check off, the server showed “Please select a future date.” and no Order Summary. No order was saved. </w:t>
       </w:r>
       <w:r>
         <w:rPr>
@@ -6790,7 +6685,7 @@
           <w:sz w:val="18"/>
           <w:szCs w:val="18"/>
         </w:rPr>
-        <w:t xml:space="preserve">Actual result (Test 10): The server answered HTTP 500 and the browser showed a blank white page with no message. The PHP log recorded “Uncaught mysqli_sql_exception: Data too long for column 'customer_name'”. No order was saved (the Orders page in Test 12 still has 11 orders). </w:t>
+        <w:t xml:space="preserve">Actual result (Test 10): The page went blank, with no message for the user. The server log said “Data too long for column 'customer_name'”. No order was saved: the Orders page in Test 12 still has 11 orders. </w:t>
       </w:r>
       <w:r>
         <w:rPr>
@@ -6821,7 +6716,7 @@
           <w:sz w:val="18"/>
           <w:szCs w:val="18"/>
         </w:rPr>
-        <w:t xml:space="preserve"> has no length check, so MySQL rejects the INSERT at line 84 and the uncaught exception stops the page.</w:t>
+        <w:t xml:space="preserve"> never checks the name length. The database refuses the long name, and the page crashes instead of showing an error.</w:t>
       </w:r>
     </w:p>
     <w:p>
@@ -6887,7 +6782,7 @@
           <w:sz w:val="18"/>
           <w:szCs w:val="18"/>
         </w:rPr>
-        <w:t xml:space="preserve">Actual result (Test 11): The server answered HTTP 500 and the browser showed a blank white page. The PHP log recorded “You have an error in your SQL syntax … near 'Connor'”. No order was saved. </w:t>
+        <w:t xml:space="preserve">Actual result (Test 11): The page went blank, with no message for the user. The server log said “You have an error in your SQL syntax … near 'Connor'”. No order was saved. </w:t>
       </w:r>
       <w:r>
         <w:rPr>
@@ -6918,7 +6813,7 @@
           <w:sz w:val="18"/>
           <w:szCs w:val="18"/>
         </w:rPr>
-        <w:t xml:space="preserve"> line 81 puts the name straight into the SQL text without escaping, so the apostrophe ends the string. The same gap allows SQL injection.</w:t>
+        <w:t xml:space="preserve"> (line 81) pastes the name straight into the database command. The apostrophe ends the name too early and breaks the command. An attacker could use the same gap to run their own database commands (SQL injection).</w:t>
       </w:r>
     </w:p>
     <w:p>
@@ -6984,7 +6879,7 @@
           <w:sz w:val="18"/>
           <w:szCs w:val="18"/>
         </w:rPr>
-        <w:t xml:space="preserve">Actual result (Test 12): The page showed 11 Total orders, $340.00 Total revenue and $30.91 Average order value. The table listed all 11 orders with service and mechanic names from the joined tables, newest date first. </w:t>
+        <w:t xml:space="preserve">Actual result (Test 12): The page showed 11 Total orders, $340.00 Total revenue and $30.91 Average order value. The table listed all 11 orders with the service and mechanic names, newest date first. </w:t>
       </w:r>
       <w:r>
         <w:rPr>
@@ -7066,7 +6961,7 @@
           <w:sz w:val="18"/>
           <w:szCs w:val="18"/>
         </w:rPr>
-        <w:t xml:space="preserve">Actual result (Test 13): The page showed “Order #1 not found.” although order 1 (Marat Usenov) is in the table below. </w:t>
+        <w:t xml:space="preserve">Actual result (Test 13): The page showed “Order #1 not found.”, yet order 1 (Marat Usenov) is in the table below it. </w:t>
       </w:r>
       <w:r>
         <w:rPr>
@@ -7097,22 +6992,7 @@
           <w:sz w:val="18"/>
           <w:szCs w:val="18"/>
         </w:rPr>
-        <w:t xml:space="preserve"> line 63 compares </w:t>
-      </w:r>
-      <w:r>
-        <w:rPr>
-          <w:rFonts w:ascii="Consolas" w:cs="Consolas" w:eastAsia="Consolas" w:hAnsi="Consolas"/>
-          <w:sz w:val="17"/>
-          <w:szCs w:val="17"/>
-        </w:rPr>
-        <w:t xml:space="preserve">order_id</w:t>
-      </w:r>
-      <w:r>
-        <w:rPr>
-          <w:sz w:val="18"/>
-          <w:szCs w:val="18"/>
-        </w:rPr>
-        <w:t xml:space="preserve">, which MySQL returns as text, with the number from the form using </w:t>
+        <w:t xml:space="preserve"> (line 63) compares the order number from the database, stored as text, with the number typed in, using a strict check (</w:t>
       </w:r>
       <w:r>
         <w:rPr>
@@ -7127,7 +7007,7 @@
           <w:sz w:val="18"/>
           <w:szCs w:val="18"/>
         </w:rPr>
-        <w:t xml:space="preserve">. Text never equals a number, so the search never finds any order.</w:t>
+        <w:t xml:space="preserve">). The strict check never matches text with a number, so the search never finds any order.</w:t>
       </w:r>
     </w:p>
     <w:p>

</xml_diff>